<commit_message>
Ziua 10 - DNS Zone File RFC 1035
</commit_message>
<xml_diff>
--- a/ziua 5/Raport_Ziua5_Alexanocikin_Nicolai.docx.docx
+++ b/ziua 5/Raport_Ziua5_Alexanocikin_Nicolai.docx.docx
@@ -38,6 +38,7 @@
           <w:rFonts w:cstheme="minorHAnsi"/>
           <w:sz w:val="48"/>
           <w:szCs w:val="48"/>
+          <w:lang w:eastAsia="ro-RO"/>
         </w:rPr>
         <w:drawing>
           <wp:inline distT="0" distB="0" distL="0" distR="0" wp14:anchorId="587DBEF3" wp14:editId="6B7A741F">
@@ -55,7 +56,7 @@
                     <pic:cNvPicPr/>
                   </pic:nvPicPr>
                   <pic:blipFill>
-                    <a:blip r:embed="rId4"/>
+                    <a:blip r:embed="rId6"/>
                     <a:stretch>
                       <a:fillRect/>
                     </a:stretch>
@@ -89,6 +90,7 @@
           <w:rFonts w:cstheme="minorHAnsi"/>
           <w:sz w:val="48"/>
           <w:szCs w:val="48"/>
+          <w:lang w:eastAsia="ro-RO"/>
         </w:rPr>
         <w:drawing>
           <wp:inline distT="0" distB="0" distL="0" distR="0" wp14:anchorId="5FF49B4D" wp14:editId="294CA23C">
@@ -106,7 +108,7 @@
                     <pic:cNvPicPr/>
                   </pic:nvPicPr>
                   <pic:blipFill>
-                    <a:blip r:embed="rId5"/>
+                    <a:blip r:embed="rId7"/>
                     <a:stretch>
                       <a:fillRect/>
                     </a:stretch>
@@ -140,6 +142,7 @@
           <w:rFonts w:cstheme="minorHAnsi"/>
           <w:sz w:val="48"/>
           <w:szCs w:val="48"/>
+          <w:lang w:eastAsia="ro-RO"/>
         </w:rPr>
         <w:lastRenderedPageBreak/>
         <w:drawing>
@@ -158,7 +161,7 @@
                     <pic:cNvPicPr/>
                   </pic:nvPicPr>
                   <pic:blipFill>
-                    <a:blip r:embed="rId6"/>
+                    <a:blip r:embed="rId8"/>
                     <a:stretch>
                       <a:fillRect/>
                     </a:stretch>
@@ -192,6 +195,7 @@
           <w:rFonts w:cstheme="minorHAnsi"/>
           <w:sz w:val="48"/>
           <w:szCs w:val="48"/>
+          <w:lang w:eastAsia="ro-RO"/>
         </w:rPr>
         <w:drawing>
           <wp:inline distT="0" distB="0" distL="0" distR="0" wp14:anchorId="175F08DD" wp14:editId="65B94454">
@@ -209,7 +213,7 @@
                     <pic:cNvPicPr/>
                   </pic:nvPicPr>
                   <pic:blipFill>
-                    <a:blip r:embed="rId7"/>
+                    <a:blip r:embed="rId9"/>
                     <a:stretch>
                       <a:fillRect/>
                     </a:stretch>
@@ -243,6 +247,7 @@
           <w:rFonts w:cstheme="minorHAnsi"/>
           <w:sz w:val="48"/>
           <w:szCs w:val="48"/>
+          <w:lang w:eastAsia="ro-RO"/>
         </w:rPr>
         <w:lastRenderedPageBreak/>
         <w:drawing>
@@ -261,7 +266,7 @@
                     <pic:cNvPicPr/>
                   </pic:nvPicPr>
                   <pic:blipFill>
-                    <a:blip r:embed="rId8"/>
+                    <a:blip r:embed="rId10"/>
                     <a:stretch>
                       <a:fillRect/>
                     </a:stretch>
@@ -295,6 +300,7 @@
           <w:rFonts w:cstheme="minorHAnsi"/>
           <w:sz w:val="48"/>
           <w:szCs w:val="48"/>
+          <w:lang w:eastAsia="ro-RO"/>
         </w:rPr>
         <w:drawing>
           <wp:inline distT="0" distB="0" distL="0" distR="0" wp14:anchorId="6360EFD2" wp14:editId="7C04F9AF">
@@ -312,7 +318,7 @@
                     <pic:cNvPicPr/>
                   </pic:nvPicPr>
                   <pic:blipFill>
-                    <a:blip r:embed="rId9"/>
+                    <a:blip r:embed="rId11"/>
                     <a:stretch>
                       <a:fillRect/>
                     </a:stretch>
@@ -346,6 +352,7 @@
           <w:rFonts w:cstheme="minorHAnsi"/>
           <w:sz w:val="48"/>
           <w:szCs w:val="48"/>
+          <w:lang w:eastAsia="ro-RO"/>
         </w:rPr>
         <w:drawing>
           <wp:inline distT="0" distB="0" distL="0" distR="0" wp14:anchorId="4B3727C8" wp14:editId="035A032B">
@@ -363,7 +370,7 @@
                     <pic:cNvPicPr/>
                   </pic:nvPicPr>
                   <pic:blipFill>
-                    <a:blip r:embed="rId10"/>
+                    <a:blip r:embed="rId12"/>
                     <a:stretch>
                       <a:fillRect/>
                     </a:stretch>
@@ -392,10 +399,105 @@
           <w:szCs w:val="48"/>
         </w:rPr>
       </w:pPr>
+      <w:r>
+        <w:rPr>
+          <w:rFonts w:cstheme="minorHAnsi"/>
+          <w:sz w:val="48"/>
+          <w:szCs w:val="48"/>
+        </w:rPr>
+        <w:lastRenderedPageBreak/>
+        <w:drawing>
+          <wp:inline distT="0" distB="0" distL="0" distR="0" wp14:anchorId="3948E186" wp14:editId="7F650EA2">
+            <wp:extent cx="4525006" cy="1467055"/>
+            <wp:effectExtent l="0" t="0" r="0" b="0"/>
+            <wp:docPr id="10" name="Imagine 10"/>
+            <wp:cNvGraphicFramePr>
+              <a:graphicFrameLocks xmlns:a="http://schemas.openxmlformats.org/drawingml/2006/main" noChangeAspect="1"/>
+            </wp:cNvGraphicFramePr>
+            <a:graphic xmlns:a="http://schemas.openxmlformats.org/drawingml/2006/main">
+              <a:graphicData uri="http://schemas.openxmlformats.org/drawingml/2006/picture">
+                <pic:pic xmlns:pic="http://schemas.openxmlformats.org/drawingml/2006/picture">
+                  <pic:nvPicPr>
+                    <pic:cNvPr id="1" name=""/>
+                    <pic:cNvPicPr/>
+                  </pic:nvPicPr>
+                  <pic:blipFill>
+                    <a:blip r:embed="rId13"/>
+                    <a:stretch>
+                      <a:fillRect/>
+                    </a:stretch>
+                  </pic:blipFill>
+                  <pic:spPr>
+                    <a:xfrm>
+                      <a:off x="0" y="0"/>
+                      <a:ext cx="4525006" cy="1467055"/>
+                    </a:xfrm>
+                    <a:prstGeom prst="rect">
+                      <a:avLst/>
+                    </a:prstGeom>
+                  </pic:spPr>
+                </pic:pic>
+              </a:graphicData>
+            </a:graphic>
+          </wp:inline>
+        </w:drawing>
+      </w:r>
+    </w:p>
+    <w:p>
+      <w:pPr>
+        <w:rPr>
+          <w:rFonts w:cstheme="minorHAnsi"/>
+          <w:sz w:val="48"/>
+          <w:szCs w:val="48"/>
+        </w:rPr>
+      </w:pPr>
       <w:bookmarkStart w:id="0" w:name="_GoBack"/>
+      <w:r>
+        <w:rPr>
+          <w:rFonts w:cstheme="minorHAnsi"/>
+          <w:sz w:val="48"/>
+          <w:szCs w:val="48"/>
+        </w:rPr>
+        <w:drawing>
+          <wp:inline distT="0" distB="0" distL="0" distR="0" wp14:anchorId="6CFADBA8" wp14:editId="0C762F65">
+            <wp:extent cx="5731510" cy="3239135"/>
+            <wp:effectExtent l="0" t="0" r="2540" b="0"/>
+            <wp:docPr id="11" name="Imagine 11"/>
+            <wp:cNvGraphicFramePr>
+              <a:graphicFrameLocks xmlns:a="http://schemas.openxmlformats.org/drawingml/2006/main" noChangeAspect="1"/>
+            </wp:cNvGraphicFramePr>
+            <a:graphic xmlns:a="http://schemas.openxmlformats.org/drawingml/2006/main">
+              <a:graphicData uri="http://schemas.openxmlformats.org/drawingml/2006/picture">
+                <pic:pic xmlns:pic="http://schemas.openxmlformats.org/drawingml/2006/picture">
+                  <pic:nvPicPr>
+                    <pic:cNvPr id="1" name=""/>
+                    <pic:cNvPicPr/>
+                  </pic:nvPicPr>
+                  <pic:blipFill>
+                    <a:blip r:embed="rId14"/>
+                    <a:stretch>
+                      <a:fillRect/>
+                    </a:stretch>
+                  </pic:blipFill>
+                  <pic:spPr>
+                    <a:xfrm>
+                      <a:off x="0" y="0"/>
+                      <a:ext cx="5731510" cy="3239135"/>
+                    </a:xfrm>
+                    <a:prstGeom prst="rect">
+                      <a:avLst/>
+                    </a:prstGeom>
+                  </pic:spPr>
+                </pic:pic>
+              </a:graphicData>
+            </a:graphic>
+          </wp:inline>
+        </w:drawing>
+      </w:r>
       <w:bookmarkEnd w:id="0"/>
     </w:p>
     <w:sectPr>
+      <w:headerReference w:type="default" r:id="rId15"/>
       <w:pgSz w:w="11906" w:h="16838"/>
       <w:pgMar w:top="1440" w:right="1440" w:bottom="1440" w:left="1440" w:header="708" w:footer="708" w:gutter="0"/>
       <w:cols w:space="708"/>
@@ -403,6 +505,84 @@
     </w:sectPr>
   </w:body>
 </w:document>
+</file>
+
+<file path=word/endnotes.xml><?xml version="1.0" encoding="utf-8"?>
+<w:endnotes xmlns:wpc="http://schemas.microsoft.com/office/word/2010/wordprocessingCanvas" xmlns:cx="http://schemas.microsoft.com/office/drawing/2014/chartex" xmlns:mc="http://schemas.openxmlformats.org/markup-compatibility/2006" xmlns:o="urn:schemas-microsoft-com:office:office" xmlns:r="http://schemas.openxmlformats.org/officeDocument/2006/relationships" xmlns:m="http://schemas.openxmlformats.org/officeDocument/2006/math" xmlns:v="urn:schemas-microsoft-com:vml" xmlns:wp14="http://schemas.microsoft.com/office/word/2010/wordprocessingDrawing" xmlns:wp="http://schemas.openxmlformats.org/drawingml/2006/wordprocessingDrawing" xmlns:w10="urn:schemas-microsoft-com:office:word" xmlns:w="http://schemas.openxmlformats.org/wordprocessingml/2006/main" xmlns:w14="http://schemas.microsoft.com/office/word/2010/wordml" xmlns:w15="http://schemas.microsoft.com/office/word/2012/wordml" xmlns:w16se="http://schemas.microsoft.com/office/word/2015/wordml/symex" xmlns:wpg="http://schemas.microsoft.com/office/word/2010/wordprocessingGroup" xmlns:wpi="http://schemas.microsoft.com/office/word/2010/wordprocessingInk" xmlns:wne="http://schemas.microsoft.com/office/word/2006/wordml" xmlns:wps="http://schemas.microsoft.com/office/word/2010/wordprocessingShape" mc:Ignorable="w14 w15 w16se wp14">
+  <w:endnote w:type="separator" w:id="-1">
+    <w:p>
+      <w:pPr>
+        <w:spacing w:after="0" w:line="240" w:lineRule="auto"/>
+      </w:pPr>
+      <w:r>
+        <w:separator/>
+      </w:r>
+    </w:p>
+  </w:endnote>
+  <w:endnote w:type="continuationSeparator" w:id="0">
+    <w:p>
+      <w:pPr>
+        <w:spacing w:after="0" w:line="240" w:lineRule="auto"/>
+      </w:pPr>
+      <w:r>
+        <w:continuationSeparator/>
+      </w:r>
+    </w:p>
+  </w:endnote>
+</w:endnotes>
+</file>
+
+<file path=word/footnotes.xml><?xml version="1.0" encoding="utf-8"?>
+<w:footnotes xmlns:wpc="http://schemas.microsoft.com/office/word/2010/wordprocessingCanvas" xmlns:cx="http://schemas.microsoft.com/office/drawing/2014/chartex" xmlns:mc="http://schemas.openxmlformats.org/markup-compatibility/2006" xmlns:o="urn:schemas-microsoft-com:office:office" xmlns:r="http://schemas.openxmlformats.org/officeDocument/2006/relationships" xmlns:m="http://schemas.openxmlformats.org/officeDocument/2006/math" xmlns:v="urn:schemas-microsoft-com:vml" xmlns:wp14="http://schemas.microsoft.com/office/word/2010/wordprocessingDrawing" xmlns:wp="http://schemas.openxmlformats.org/drawingml/2006/wordprocessingDrawing" xmlns:w10="urn:schemas-microsoft-com:office:word" xmlns:w="http://schemas.openxmlformats.org/wordprocessingml/2006/main" xmlns:w14="http://schemas.microsoft.com/office/word/2010/wordml" xmlns:w15="http://schemas.microsoft.com/office/word/2012/wordml" xmlns:w16se="http://schemas.microsoft.com/office/word/2015/wordml/symex" xmlns:wpg="http://schemas.microsoft.com/office/word/2010/wordprocessingGroup" xmlns:wpi="http://schemas.microsoft.com/office/word/2010/wordprocessingInk" xmlns:wne="http://schemas.microsoft.com/office/word/2006/wordml" xmlns:wps="http://schemas.microsoft.com/office/word/2010/wordprocessingShape" mc:Ignorable="w14 w15 w16se wp14">
+  <w:footnote w:type="separator" w:id="-1">
+    <w:p>
+      <w:pPr>
+        <w:spacing w:after="0" w:line="240" w:lineRule="auto"/>
+      </w:pPr>
+      <w:r>
+        <w:separator/>
+      </w:r>
+    </w:p>
+  </w:footnote>
+  <w:footnote w:type="continuationSeparator" w:id="0">
+    <w:p>
+      <w:pPr>
+        <w:spacing w:after="0" w:line="240" w:lineRule="auto"/>
+      </w:pPr>
+      <w:r>
+        <w:continuationSeparator/>
+      </w:r>
+    </w:p>
+  </w:footnote>
+</w:footnotes>
+</file>
+
+<file path=word/header1.xml><?xml version="1.0" encoding="utf-8"?>
+<w:hdr xmlns:wpc="http://schemas.microsoft.com/office/word/2010/wordprocessingCanvas" xmlns:cx="http://schemas.microsoft.com/office/drawing/2014/chartex" xmlns:mc="http://schemas.openxmlformats.org/markup-compatibility/2006" xmlns:o="urn:schemas-microsoft-com:office:office" xmlns:r="http://schemas.openxmlformats.org/officeDocument/2006/relationships" xmlns:m="http://schemas.openxmlformats.org/officeDocument/2006/math" xmlns:v="urn:schemas-microsoft-com:vml" xmlns:wp14="http://schemas.microsoft.com/office/word/2010/wordprocessingDrawing" xmlns:wp="http://schemas.openxmlformats.org/drawingml/2006/wordprocessingDrawing" xmlns:w10="urn:schemas-microsoft-com:office:word" xmlns:w="http://schemas.openxmlformats.org/wordprocessingml/2006/main" xmlns:w14="http://schemas.microsoft.com/office/word/2010/wordml" xmlns:w15="http://schemas.microsoft.com/office/word/2012/wordml" xmlns:w16se="http://schemas.microsoft.com/office/word/2015/wordml/symex" xmlns:wpg="http://schemas.microsoft.com/office/word/2010/wordprocessingGroup" xmlns:wpi="http://schemas.microsoft.com/office/word/2010/wordprocessingInk" xmlns:wne="http://schemas.microsoft.com/office/word/2006/wordml" xmlns:wps="http://schemas.microsoft.com/office/word/2010/wordprocessingShape" mc:Ignorable="w14 w15 w16se wp14">
+  <w:p>
+    <w:pPr>
+      <w:pStyle w:val="Antet"/>
+      <w:rPr>
+        <w:rFonts w:ascii="Arial" w:hAnsi="Arial" w:cs="Arial"/>
+        <w:color w:val="000000"/>
+      </w:rPr>
+    </w:pPr>
+    <w:r>
+      <w:rPr>
+        <w:rFonts w:ascii="Arial" w:hAnsi="Arial" w:cs="Arial"/>
+        <w:color w:val="000000"/>
+      </w:rPr>
+      <w:t xml:space="preserve">Alexanocikin Nicolai, Grupa RC 251, </w:t>
+    </w:r>
+    <w:r>
+      <w:rPr>
+        <w:rFonts w:ascii="Arial" w:hAnsi="Arial" w:cs="Arial"/>
+        <w:color w:val="000000"/>
+      </w:rPr>
+      <w:t>08.05.2026</w:t>
+    </w:r>
+  </w:p>
+</w:hdr>
 </file>
 
 <file path=word/styles.xml><?xml version="1.0" encoding="utf-8"?>
@@ -829,6 +1009,56 @@
     <w:semiHidden/>
     <w:unhideWhenUsed/>
   </w:style>
+  <w:style w:type="paragraph" w:styleId="Antet">
+    <w:name w:val="header"/>
+    <w:basedOn w:val="Normal"/>
+    <w:link w:val="AntetCaracter"/>
+    <w:uiPriority w:val="99"/>
+    <w:unhideWhenUsed/>
+    <w:rsid w:val="004416A8"/>
+    <w:pPr>
+      <w:tabs>
+        <w:tab w:val="center" w:pos="4513"/>
+        <w:tab w:val="right" w:pos="9026"/>
+      </w:tabs>
+      <w:spacing w:after="0" w:line="240" w:lineRule="auto"/>
+    </w:pPr>
+  </w:style>
+  <w:style w:type="character" w:customStyle="1" w:styleId="AntetCaracter">
+    <w:name w:val="Antet Caracter"/>
+    <w:basedOn w:val="Fontdeparagrafimplicit"/>
+    <w:link w:val="Antet"/>
+    <w:uiPriority w:val="99"/>
+    <w:rsid w:val="004416A8"/>
+    <w:rPr>
+      <w:noProof/>
+    </w:rPr>
+  </w:style>
+  <w:style w:type="paragraph" w:styleId="Subsol">
+    <w:name w:val="footer"/>
+    <w:basedOn w:val="Normal"/>
+    <w:link w:val="SubsolCaracter"/>
+    <w:uiPriority w:val="99"/>
+    <w:unhideWhenUsed/>
+    <w:rsid w:val="004416A8"/>
+    <w:pPr>
+      <w:tabs>
+        <w:tab w:val="center" w:pos="4513"/>
+        <w:tab w:val="right" w:pos="9026"/>
+      </w:tabs>
+      <w:spacing w:after="0" w:line="240" w:lineRule="auto"/>
+    </w:pPr>
+  </w:style>
+  <w:style w:type="character" w:customStyle="1" w:styleId="SubsolCaracter">
+    <w:name w:val="Subsol Caracter"/>
+    <w:basedOn w:val="Fontdeparagrafimplicit"/>
+    <w:link w:val="Subsol"/>
+    <w:uiPriority w:val="99"/>
+    <w:rsid w:val="004416A8"/>
+    <w:rPr>
+      <w:noProof/>
+    </w:rPr>
+  </w:style>
 </w:styles>
 </file>
 

</xml_diff>